<commit_message>
Editor runtime for Linux (Docker): install, licence, backup and update scripts
- deploy/editor and tools/package-editor.sh: CortexSkills-editor-runtime-linux zip, the customer image
  with HTTPS (Caddy profile), install.sh (secrets generated, waits until healthy, removes the admin
  password), licence.sh (create-org, list, request, install), backup.sh (copy out, retention,
  off-site rsync), update.sh (new release on the same data). No signing tool, no private key.
- admin org-list shows the installed licence end date in OnPrem mode.
- Editor guide: scenario 2 and the Linux laptop use the editor runtime.

Co-Authored-By: Claude Opus 5.5 <noreply@anthropic.com>
Claude-Session: https://claude.ai/code/session_01CPoP9gXznxAoCuDQx1kksH
</commit_message>
<xml_diff>
--- a/cortexskills/deliverables/CortexSkills_Editor_Installation_and_Licensing_Guide.docx
+++ b/cortexskills/deliverables/CortexSkills_Editor_Installation_and_Licensing_Guide.docx
@@ -225,7 +225,7 @@
             </w:rPr>
             <w:fldChar w:fldCharType="separate"/>
           </w:r>
-          <w:hyperlink w:anchor="__RefHeading___Toc1251_2642403109">
+          <w:hyperlink w:anchor="__RefHeading___Toc570_3511503178">
             <w:r>
               <w:rPr>
                 <w:rStyle w:val="IndexLink"/>
@@ -245,7 +245,7 @@
             </w:tabs>
             <w:rPr/>
           </w:pPr>
-          <w:hyperlink w:anchor="__RefHeading___Toc1253_2642403109">
+          <w:hyperlink w:anchor="__RefHeading___Toc572_3511503178">
             <w:r>
               <w:rPr>
                 <w:rStyle w:val="IndexLink"/>
@@ -265,7 +265,7 @@
             </w:tabs>
             <w:rPr/>
           </w:pPr>
-          <w:hyperlink w:anchor="__RefHeading___Toc1255_2642403109">
+          <w:hyperlink w:anchor="__RefHeading___Toc574_3511503178">
             <w:r>
               <w:rPr>
                 <w:rStyle w:val="IndexLink"/>
@@ -285,7 +285,7 @@
             </w:tabs>
             <w:rPr/>
           </w:pPr>
-          <w:hyperlink w:anchor="__RefHeading___Toc1257_2642403109">
+          <w:hyperlink w:anchor="__RefHeading___Toc576_3511503178">
             <w:r>
               <w:rPr>
                 <w:rStyle w:val="IndexLink"/>
@@ -305,7 +305,7 @@
             </w:tabs>
             <w:rPr/>
           </w:pPr>
-          <w:hyperlink w:anchor="__RefHeading___Toc1259_2642403109">
+          <w:hyperlink w:anchor="__RefHeading___Toc578_3511503178">
             <w:r>
               <w:rPr>
                 <w:rStyle w:val="IndexLink"/>
@@ -325,7 +325,7 @@
             </w:tabs>
             <w:rPr/>
           </w:pPr>
-          <w:hyperlink w:anchor="__RefHeading___Toc1261_2642403109">
+          <w:hyperlink w:anchor="__RefHeading___Toc580_3511503178">
             <w:r>
               <w:rPr>
                 <w:rStyle w:val="IndexLink"/>
@@ -345,7 +345,7 @@
             </w:tabs>
             <w:rPr/>
           </w:pPr>
-          <w:hyperlink w:anchor="__RefHeading___Toc1263_2642403109">
+          <w:hyperlink w:anchor="__RefHeading___Toc582_3511503178">
             <w:r>
               <w:rPr>
                 <w:rStyle w:val="IndexLink"/>
@@ -365,7 +365,7 @@
             </w:tabs>
             <w:rPr/>
           </w:pPr>
-          <w:hyperlink w:anchor="__RefHeading___Toc1265_2642403109">
+          <w:hyperlink w:anchor="__RefHeading___Toc584_3511503178">
             <w:r>
               <w:rPr>
                 <w:rStyle w:val="IndexLink"/>
@@ -385,12 +385,12 @@
             </w:tabs>
             <w:rPr/>
           </w:pPr>
-          <w:hyperlink w:anchor="__RefHeading___Toc1267_2642403109">
+          <w:hyperlink w:anchor="__RefHeading___Toc586_3511503178">
             <w:r>
               <w:rPr>
                 <w:rStyle w:val="IndexLink"/>
               </w:rPr>
-              <w:t>4.2 Docker on your laptop (alternative)</w:t>
+              <w:t>4.2 Docker on a Linux laptop (alternative)</w:t>
               <w:tab/>
               <w:t>7</w:t>
             </w:r>
@@ -405,7 +405,7 @@
             </w:tabs>
             <w:rPr/>
           </w:pPr>
-          <w:hyperlink w:anchor="__RefHeading___Toc1269_2642403109">
+          <w:hyperlink w:anchor="__RefHeading___Toc588_3511503178">
             <w:r>
               <w:rPr>
                 <w:rStyle w:val="IndexLink"/>
@@ -425,7 +425,7 @@
             </w:tabs>
             <w:rPr/>
           </w:pPr>
-          <w:hyperlink w:anchor="__RefHeading___Toc1271_2642403109">
+          <w:hyperlink w:anchor="__RefHeading___Toc590_3511503178">
             <w:r>
               <w:rPr>
                 <w:rStyle w:val="IndexLink"/>
@@ -445,7 +445,7 @@
             </w:tabs>
             <w:rPr/>
           </w:pPr>
-          <w:hyperlink w:anchor="__RefHeading___Toc1273_2642403109">
+          <w:hyperlink w:anchor="__RefHeading___Toc592_3511503178">
             <w:r>
               <w:rPr>
                 <w:rStyle w:val="IndexLink"/>
@@ -465,7 +465,7 @@
             </w:tabs>
             <w:rPr/>
           </w:pPr>
-          <w:hyperlink w:anchor="__RefHeading___Toc1275_2642403109">
+          <w:hyperlink w:anchor="__RefHeading___Toc594_3511503178">
             <w:r>
               <w:rPr>
                 <w:rStyle w:val="IndexLink"/>
@@ -485,12 +485,12 @@
             </w:tabs>
             <w:rPr/>
           </w:pPr>
-          <w:hyperlink w:anchor="__RefHeading___Toc1277_2642403109">
+          <w:hyperlink w:anchor="__RefHeading___Toc596_3511503178">
             <w:r>
               <w:rPr>
                 <w:rStyle w:val="IndexLink"/>
               </w:rPr>
-              <w:t>6. Scenario 2 — CortexSkills on your VPS with Docker (editor version)</w:t>
+              <w:t>6. Scenario 2 — CortexSkills on your VPS with Docker (editor runtime)</w:t>
               <w:tab/>
               <w:t>9</w:t>
             </w:r>
@@ -505,7 +505,7 @@
             </w:tabs>
             <w:rPr/>
           </w:pPr>
-          <w:hyperlink w:anchor="__RefHeading___Toc1279_2642403109">
+          <w:hyperlink w:anchor="__RefHeading___Toc598_3511503178">
             <w:r>
               <w:rPr>
                 <w:rStyle w:val="IndexLink"/>
@@ -525,7 +525,7 @@
             </w:tabs>
             <w:rPr/>
           </w:pPr>
-          <w:hyperlink w:anchor="__RefHeading___Toc1281_2642403109">
+          <w:hyperlink w:anchor="__RefHeading___Toc600_3511503178">
             <w:r>
               <w:rPr>
                 <w:rStyle w:val="IndexLink"/>
@@ -545,7 +545,7 @@
             </w:tabs>
             <w:rPr/>
           </w:pPr>
-          <w:hyperlink w:anchor="__RefHeading___Toc1283_2642403109">
+          <w:hyperlink w:anchor="__RefHeading___Toc602_3511503178">
             <w:r>
               <w:rPr>
                 <w:rStyle w:val="IndexLink"/>
@@ -565,7 +565,7 @@
             </w:tabs>
             <w:rPr/>
           </w:pPr>
-          <w:hyperlink w:anchor="__RefHeading___Toc1285_2642403109">
+          <w:hyperlink w:anchor="__RefHeading___Toc604_3511503178">
             <w:r>
               <w:rPr>
                 <w:rStyle w:val="IndexLink"/>
@@ -585,7 +585,7 @@
             </w:tabs>
             <w:rPr/>
           </w:pPr>
-          <w:hyperlink w:anchor="__RefHeading___Toc1287_2642403109">
+          <w:hyperlink w:anchor="__RefHeading___Toc606_3511503178">
             <w:r>
               <w:rPr>
                 <w:rStyle w:val="IndexLink"/>
@@ -605,7 +605,7 @@
             </w:tabs>
             <w:rPr/>
           </w:pPr>
-          <w:hyperlink w:anchor="__RefHeading___Toc1289_2642403109">
+          <w:hyperlink w:anchor="__RefHeading___Toc608_3511503178">
             <w:r>
               <w:rPr>
                 <w:rStyle w:val="IndexLink"/>
@@ -625,7 +625,7 @@
             </w:tabs>
             <w:rPr/>
           </w:pPr>
-          <w:hyperlink w:anchor="__RefHeading___Toc1291_2642403109">
+          <w:hyperlink w:anchor="__RefHeading___Toc610_3511503178">
             <w:r>
               <w:rPr>
                 <w:rStyle w:val="IndexLink"/>
@@ -645,7 +645,7 @@
             </w:tabs>
             <w:rPr/>
           </w:pPr>
-          <w:hyperlink w:anchor="__RefHeading___Toc1293_2642403109">
+          <w:hyperlink w:anchor="__RefHeading___Toc612_3511503178">
             <w:r>
               <w:rPr>
                 <w:rStyle w:val="IndexLink"/>
@@ -665,7 +665,7 @@
             </w:tabs>
             <w:rPr/>
           </w:pPr>
-          <w:hyperlink w:anchor="__RefHeading___Toc1295_2642403109">
+          <w:hyperlink w:anchor="__RefHeading___Toc614_3511503178">
             <w:r>
               <w:rPr>
                 <w:rStyle w:val="IndexLink"/>
@@ -709,7 +709,7 @@
         <w:spacing w:before="0" w:after="240"/>
         <w:rPr/>
       </w:pPr>
-      <w:bookmarkStart w:id="0" w:name="__RefHeading___Toc1251_2642403109"/>
+      <w:bookmarkStart w:id="0" w:name="__RefHeading___Toc570_3511503178"/>
       <w:bookmarkEnd w:id="0"/>
       <w:r>
         <w:rPr>
@@ -1264,7 +1264,7 @@
                 <w:sz w:val="16"/>
                 <w:szCs w:val="16"/>
               </w:rPr>
-              <w:t>CortexSkills-docker-1.15.0.zip</w:t>
+              <w:t>CortexSkills-editor-runtime-linux-1.15.0.zip</w:t>
             </w:r>
           </w:p>
         </w:tc>
@@ -1294,7 +1294,7 @@
                 <w:sz w:val="16"/>
                 <w:szCs w:val="16"/>
               </w:rPr>
-              <w:t>Dockerfile, compose files, settings template and the application. No signing tool, no private key.</w:t>
+              <w:t>Your own runtime on Linux with Docker: the customer image plus HTTPS and install, licence, backup and update scripts. No signing tool, no private key.</w:t>
             </w:r>
           </w:p>
         </w:tc>
@@ -1324,7 +1324,7 @@
                 <w:sz w:val="16"/>
                 <w:szCs w:val="16"/>
               </w:rPr>
-              <w:t>Scenario 2 (your VPS) and every customer installing with Docker.</w:t>
+              <w:t>Scenario 2: your VPS (or a Linux laptop with Docker).</w:t>
             </w:r>
           </w:p>
         </w:tc>
@@ -1359,7 +1359,7 @@
                 <w:sz w:val="16"/>
                 <w:szCs w:val="16"/>
               </w:rPr>
-              <w:t>Customer Installation Guide (PDF)</w:t>
+              <w:t>CortexSkills-docker-1.15.0.zip</w:t>
             </w:r>
           </w:p>
         </w:tc>
@@ -1389,7 +1389,7 @@
                 <w:sz w:val="16"/>
                 <w:szCs w:val="16"/>
               </w:rPr>
-              <w:t>Docker on Linux, settings, licence request and installation, operation. No commercial content.</w:t>
+              <w:t>Dockerfile, compose files, settings template and the application. No signing tool, no private key.</w:t>
             </w:r>
           </w:p>
         </w:tc>
@@ -1419,7 +1419,7 @@
                 <w:sz w:val="16"/>
                 <w:szCs w:val="16"/>
               </w:rPr>
-              <w:t>Sent to each customer with the bundle.</w:t>
+              <w:t>Scenario 2 (your VPS) and every customer installing with Docker.</w:t>
             </w:r>
           </w:p>
         </w:tc>
@@ -1454,6 +1454,101 @@
                 <w:sz w:val="16"/>
                 <w:szCs w:val="16"/>
               </w:rPr>
+              <w:t>Customer Installation Guide (PDF)</w:t>
+            </w:r>
+          </w:p>
+        </w:tc>
+        <w:tc>
+          <w:tcPr>
+            <w:tcW w:w="3797" w:type="dxa"/>
+            <w:tcBorders>
+              <w:top w:val="single" w:sz="4" w:space="0" w:color="E1E8F0"/>
+              <w:left w:val="single" w:sz="4" w:space="0" w:color="E1E8F0"/>
+              <w:bottom w:val="single" w:sz="4" w:space="0" w:color="E1E8F0"/>
+              <w:right w:val="single" w:sz="4" w:space="0" w:color="E1E8F0"/>
+            </w:tcBorders>
+            <w:shd w:color="auto" w:fill="FFFFFF" w:val="clear"/>
+          </w:tcPr>
+          <w:p>
+            <w:pPr>
+              <w:pStyle w:val="Normal"/>
+              <w:spacing w:before="0" w:after="20"/>
+              <w:rPr/>
+            </w:pPr>
+            <w:r>
+              <w:rPr>
+                <w:rFonts w:eastAsia="Open Sans" w:cs="Open Sans"/>
+                <w:b w:val="false"/>
+                <w:bCs w:val="false"/>
+                <w:color w:val="2C3E50"/>
+                <w:sz w:val="16"/>
+                <w:szCs w:val="16"/>
+              </w:rPr>
+              <w:t>Docker on Linux, settings, licence request and installation, operation. No commercial content.</w:t>
+            </w:r>
+          </w:p>
+        </w:tc>
+        <w:tc>
+          <w:tcPr>
+            <w:tcW w:w="3444" w:type="dxa"/>
+            <w:tcBorders>
+              <w:top w:val="single" w:sz="4" w:space="0" w:color="E1E8F0"/>
+              <w:left w:val="single" w:sz="4" w:space="0" w:color="E1E8F0"/>
+              <w:bottom w:val="single" w:sz="4" w:space="0" w:color="E1E8F0"/>
+              <w:right w:val="single" w:sz="4" w:space="0" w:color="E1E8F0"/>
+            </w:tcBorders>
+            <w:shd w:color="auto" w:fill="FFFFFF" w:val="clear"/>
+          </w:tcPr>
+          <w:p>
+            <w:pPr>
+              <w:pStyle w:val="Normal"/>
+              <w:spacing w:before="0" w:after="20"/>
+              <w:rPr/>
+            </w:pPr>
+            <w:r>
+              <w:rPr>
+                <w:rFonts w:eastAsia="Open Sans" w:cs="Open Sans"/>
+                <w:b w:val="false"/>
+                <w:bCs w:val="false"/>
+                <w:color w:val="2C3E50"/>
+                <w:sz w:val="16"/>
+                <w:szCs w:val="16"/>
+              </w:rPr>
+              <w:t>Sent to each customer with the bundle.</w:t>
+            </w:r>
+          </w:p>
+        </w:tc>
+      </w:tr>
+      <w:tr>
+        <w:trPr>
+          <w:cantSplit w:val="true"/>
+        </w:trPr>
+        <w:tc>
+          <w:tcPr>
+            <w:tcW w:w="2397" w:type="dxa"/>
+            <w:tcBorders>
+              <w:top w:val="single" w:sz="4" w:space="0" w:color="E1E8F0"/>
+              <w:left w:val="single" w:sz="4" w:space="0" w:color="E1E8F0"/>
+              <w:bottom w:val="single" w:sz="4" w:space="0" w:color="E1E8F0"/>
+              <w:right w:val="single" w:sz="4" w:space="0" w:color="E1E8F0"/>
+            </w:tcBorders>
+            <w:shd w:color="auto" w:fill="F5F8FB" w:val="clear"/>
+          </w:tcPr>
+          <w:p>
+            <w:pPr>
+              <w:pStyle w:val="Normal"/>
+              <w:spacing w:before="0" w:after="20"/>
+              <w:rPr/>
+            </w:pPr>
+            <w:r>
+              <w:rPr>
+                <w:rFonts w:eastAsia="Open Sans" w:cs="Open Sans"/>
+                <w:b w:val="false"/>
+                <w:bCs w:val="false"/>
+                <w:color w:val="2C3E50"/>
+                <w:sz w:val="16"/>
+                <w:szCs w:val="16"/>
+              </w:rPr>
               <w:t>&lt;Customer&gt;.lic</w:t>
             </w:r>
           </w:p>
@@ -1467,7 +1562,7 @@
               <w:bottom w:val="single" w:sz="4" w:space="0" w:color="E1E8F0"/>
               <w:right w:val="single" w:sz="4" w:space="0" w:color="E1E8F0"/>
             </w:tcBorders>
-            <w:shd w:color="auto" w:fill="FFFFFF" w:val="clear"/>
+            <w:shd w:color="auto" w:fill="F5F8FB" w:val="clear"/>
           </w:tcPr>
           <w:p>
             <w:pPr>
@@ -1497,7 +1592,7 @@
               <w:bottom w:val="single" w:sz="4" w:space="0" w:color="E1E8F0"/>
               <w:right w:val="single" w:sz="4" w:space="0" w:color="E1E8F0"/>
             </w:tcBorders>
-            <w:shd w:color="auto" w:fill="FFFFFF" w:val="clear"/>
+            <w:shd w:color="auto" w:fill="F5F8FB" w:val="clear"/>
           </w:tcPr>
           <w:p>
             <w:pPr>
@@ -1609,7 +1704,7 @@
       <w:r>
         <w:br w:type="page"/>
       </w:r>
-      <w:bookmarkStart w:id="1" w:name="__RefHeading___Toc1253_2642403109"/>
+      <w:bookmarkStart w:id="1" w:name="__RefHeading___Toc572_3511503178"/>
       <w:bookmarkEnd w:id="1"/>
       <w:r>
         <w:rPr>
@@ -1862,7 +1957,7 @@
         <w:spacing w:before="0" w:after="240"/>
         <w:rPr/>
       </w:pPr>
-      <w:bookmarkStart w:id="2" w:name="__RefHeading___Toc1255_2642403109"/>
+      <w:bookmarkStart w:id="2" w:name="__RefHeading___Toc574_3511503178"/>
       <w:bookmarkEnd w:id="2"/>
       <w:r>
         <w:rPr>
@@ -1883,7 +1978,7 @@
         <w:spacing w:before="320" w:after="120"/>
         <w:rPr/>
       </w:pPr>
-      <w:bookmarkStart w:id="3" w:name="__RefHeading___Toc1257_2642403109"/>
+      <w:bookmarkStart w:id="3" w:name="__RefHeading___Toc576_3511503178"/>
       <w:bookmarkEnd w:id="3"/>
       <w:r>
         <w:rPr>
@@ -2001,7 +2096,7 @@
         <w:spacing w:before="320" w:after="120"/>
         <w:rPr/>
       </w:pPr>
-      <w:bookmarkStart w:id="4" w:name="__RefHeading___Toc1259_2642403109"/>
+      <w:bookmarkStart w:id="4" w:name="__RefHeading___Toc578_3511503178"/>
       <w:bookmarkEnd w:id="4"/>
       <w:r>
         <w:rPr>
@@ -2140,7 +2235,7 @@
         <w:spacing w:before="320" w:after="120"/>
         <w:rPr/>
       </w:pPr>
-      <w:bookmarkStart w:id="5" w:name="__RefHeading___Toc1261_2642403109"/>
+      <w:bookmarkStart w:id="5" w:name="__RefHeading___Toc580_3511503178"/>
       <w:bookmarkEnd w:id="5"/>
       <w:r>
         <w:rPr>
@@ -2445,7 +2540,7 @@
       <w:r>
         <w:br w:type="page"/>
       </w:r>
-      <w:bookmarkStart w:id="6" w:name="__RefHeading___Toc1263_2642403109"/>
+      <w:bookmarkStart w:id="6" w:name="__RefHeading___Toc582_3511503178"/>
       <w:bookmarkEnd w:id="6"/>
       <w:r>
         <w:rPr>
@@ -2483,7 +2578,7 @@
         <w:spacing w:before="320" w:after="120"/>
         <w:rPr/>
       </w:pPr>
-      <w:bookmarkStart w:id="7" w:name="__RefHeading___Toc1265_2642403109"/>
+      <w:bookmarkStart w:id="7" w:name="__RefHeading___Toc584_3511503178"/>
       <w:bookmarkEnd w:id="7"/>
       <w:r>
         <w:rPr>
@@ -3096,7 +3191,7 @@
         <w:spacing w:before="320" w:after="120"/>
         <w:rPr/>
       </w:pPr>
-      <w:bookmarkStart w:id="8" w:name="__RefHeading___Toc1267_2642403109"/>
+      <w:bookmarkStart w:id="8" w:name="__RefHeading___Toc586_3511503178"/>
       <w:bookmarkEnd w:id="8"/>
       <w:r>
         <w:rPr>
@@ -3107,7 +3202,7 @@
           <w:sz w:val="32"/>
           <w:szCs w:val="32"/>
         </w:rPr>
-        <w:t>4.2 Docker on your laptop (alternative)</w:t>
+        <w:t>4.2 Docker on a Linux laptop (alternative)</w:t>
       </w:r>
     </w:p>
     <w:p>
@@ -3124,7 +3219,7 @@
           <w:sz w:val="22"/>
           <w:szCs w:val="22"/>
         </w:rPr>
-        <w:t>With Docker Desktop or Docker Engine, the bundle of section 3.1 works on the laptop too: in .env set PUBLIC_URL and CORS_ORIGIN to http://localhost:4000, then docker build -t cortexskills:1.15.0 . and docker compose up -d. The commands of section 5.2 then apply, with docker compose exec cortexskills cortexskills-admin in place of npm run admin --.</w:t>
+        <w:t>On a Linux laptop with Docker, use the editor runtime of section 6 with the domain localhost: ./install.sh asks the domain — answer localhost — and the application opens at http://localhost:4000 without an HTTPS front end. The licence commands of section 7 then apply on the laptop.</w:t>
       </w:r>
       <w:r>
         <w:br w:type="page"/>
@@ -3139,7 +3234,7 @@
         <w:spacing w:before="0" w:after="240"/>
         <w:rPr/>
       </w:pPr>
-      <w:bookmarkStart w:id="9" w:name="__RefHeading___Toc1269_2642403109"/>
+      <w:bookmarkStart w:id="9" w:name="__RefHeading___Toc588_3511503178"/>
       <w:bookmarkEnd w:id="9"/>
       <w:r>
         <w:rPr>
@@ -3160,7 +3255,7 @@
         <w:spacing w:before="320" w:after="120"/>
         <w:rPr/>
       </w:pPr>
-      <w:bookmarkStart w:id="10" w:name="__RefHeading___Toc1271_2642403109"/>
+      <w:bookmarkStart w:id="10" w:name="__RefHeading___Toc590_3511503178"/>
       <w:bookmarkEnd w:id="10"/>
       <w:r>
         <w:rPr>
@@ -3321,7 +3416,7 @@
         <w:spacing w:before="320" w:after="120"/>
         <w:rPr/>
       </w:pPr>
-      <w:bookmarkStart w:id="11" w:name="__RefHeading___Toc1273_2642403109"/>
+      <w:bookmarkStart w:id="11" w:name="__RefHeading___Toc592_3511503178"/>
       <w:bookmarkEnd w:id="11"/>
       <w:r>
         <w:rPr>
@@ -4224,7 +4319,7 @@
         <w:spacing w:before="320" w:after="120"/>
         <w:rPr/>
       </w:pPr>
-      <w:bookmarkStart w:id="12" w:name="__RefHeading___Toc1275_2642403109"/>
+      <w:bookmarkStart w:id="12" w:name="__RefHeading___Toc594_3511503178"/>
       <w:bookmarkEnd w:id="12"/>
       <w:r>
         <w:rPr>
@@ -4309,7 +4404,7 @@
         <w:spacing w:before="0" w:after="240"/>
         <w:rPr/>
       </w:pPr>
-      <w:bookmarkStart w:id="13" w:name="__RefHeading___Toc1277_2642403109"/>
+      <w:bookmarkStart w:id="13" w:name="__RefHeading___Toc596_3511503178"/>
       <w:bookmarkEnd w:id="13"/>
       <w:r>
         <w:rPr>
@@ -4320,7 +4415,7 @@
           <w:sz w:val="40"/>
           <w:szCs w:val="40"/>
         </w:rPr>
-        <w:t>6. Scenario 2 — CortexSkills on your VPS with Docker (editor version)</w:t>
+        <w:t>6. Scenario 2 — CortexSkills on your VPS with Docker (editor runtime)</w:t>
       </w:r>
     </w:p>
     <w:p>
@@ -4337,322 +4432,7 @@
           <w:sz w:val="22"/>
           <w:szCs w:val="22"/>
         </w:rPr>
-        <w:t>Use it for a hosted pilot or demonstration reachable over the Internet, for example on a HeberJahiz Cloud 2 VPS (2 vCores, 4 GB RAM, 25 GB) with Ubuntu 24.04. The “editor version” is the same image as the customers’ one, with the HTTPS front end and your own settings — the private key and the signing tool stay on your laptop.</w:t>
-      </w:r>
-    </w:p>
-    <w:p>
-      <w:pPr>
-        <w:pStyle w:val="Heading2"/>
-        <w:keepNext w:val="true"/>
-        <w:spacing w:before="320" w:after="120"/>
-        <w:rPr/>
-      </w:pPr>
-      <w:bookmarkStart w:id="14" w:name="__RefHeading___Toc1279_2642403109"/>
-      <w:bookmarkEnd w:id="14"/>
-      <w:r>
-        <w:rPr>
-          <w:rFonts w:eastAsia="Montserrat" w:cs="Montserrat"/>
-          <w:b/>
-          <w:bCs/>
-          <w:color w:val="123A5F"/>
-          <w:sz w:val="32"/>
-          <w:szCs w:val="32"/>
-        </w:rPr>
-        <w:t>6.1 Prepare the VPS (once)</w:t>
-      </w:r>
-    </w:p>
-    <w:p>
-      <w:pPr>
-        <w:pStyle w:val="ListParagraph"/>
-        <w:numPr>
-          <w:ilvl w:val="0"/>
-          <w:numId w:val="0"/>
-        </w:numPr>
-        <w:spacing w:lineRule="auto" w:line="288" w:before="0" w:after="80"/>
-        <w:ind w:hanging="0" w:left="0"/>
-        <w:rPr/>
-      </w:pPr>
-      <w:r>
-        <w:rPr>
-          <w:rFonts w:eastAsia="Open Sans" w:cs="Open Sans"/>
-          <w:color w:val="2C3E50"/>
-          <w:sz w:val="22"/>
-          <w:szCs w:val="22"/>
-        </w:rPr>
-        <w:t>Create a DNS record A: skills.yourdomain.com → public IP of the VPS.</w:t>
-      </w:r>
-    </w:p>
-    <w:p>
-      <w:pPr>
-        <w:pStyle w:val="ListParagraph"/>
-        <w:numPr>
-          <w:ilvl w:val="0"/>
-          <w:numId w:val="0"/>
-        </w:numPr>
-        <w:spacing w:lineRule="auto" w:line="288" w:before="0" w:after="80"/>
-        <w:ind w:hanging="0" w:left="0"/>
-        <w:rPr/>
-      </w:pPr>
-      <w:r>
-        <w:rPr>
-          <w:rFonts w:eastAsia="Open Sans" w:cs="Open Sans"/>
-          <w:color w:val="2C3E50"/>
-          <w:sz w:val="22"/>
-          <w:szCs w:val="22"/>
-        </w:rPr>
-        <w:t>Connect with SSH, create an administrator user, use SSH keys, and open only the needed ports:</w:t>
-      </w:r>
-    </w:p>
-    <w:p>
-      <w:pPr>
-        <w:pStyle w:val="Normal"/>
-        <w:pBdr>
-          <w:left w:val="single" w:sz="12" w:space="8" w:color="1876C6"/>
-        </w:pBdr>
-        <w:shd w:val="clear" w:color="auto" w:fill="F5F8FB"/>
-        <w:spacing w:before="0" w:after="80"/>
-        <w:ind w:left="240"/>
-        <w:rPr/>
-      </w:pPr>
-      <w:r>
-        <w:rPr>
-          <w:rFonts w:eastAsia="JetBrains Mono" w:cs="JetBrains Mono" w:ascii="JetBrains Mono" w:hAnsi="JetBrains Mono"/>
-          <w:color w:val="123A5F"/>
-          <w:sz w:val="18"/>
-          <w:szCs w:val="18"/>
-        </w:rPr>
-        <w:t>sudo apt update &amp;&amp; sudo apt -y upgrade</w:t>
-      </w:r>
-    </w:p>
-    <w:p>
-      <w:pPr>
-        <w:pStyle w:val="Normal"/>
-        <w:pBdr>
-          <w:left w:val="single" w:sz="12" w:space="8" w:color="1876C6"/>
-        </w:pBdr>
-        <w:shd w:val="clear" w:color="auto" w:fill="F5F8FB"/>
-        <w:spacing w:before="0" w:after="80"/>
-        <w:ind w:left="240"/>
-        <w:rPr/>
-      </w:pPr>
-      <w:r>
-        <w:rPr>
-          <w:rFonts w:eastAsia="JetBrains Mono" w:cs="JetBrains Mono" w:ascii="JetBrains Mono" w:hAnsi="JetBrains Mono"/>
-          <w:color w:val="123A5F"/>
-          <w:sz w:val="18"/>
-          <w:szCs w:val="18"/>
-        </w:rPr>
-        <w:t>sudo ufw allow OpenSSH &amp;&amp; sudo ufw allow 80/tcp &amp;&amp; sudo ufw allow 443/tcp &amp;&amp; sudo ufw enable</w:t>
-      </w:r>
-    </w:p>
-    <w:p>
-      <w:pPr>
-        <w:pStyle w:val="Normal"/>
-        <w:pBdr>
-          <w:left w:val="single" w:sz="12" w:space="8" w:color="1876C6"/>
-        </w:pBdr>
-        <w:shd w:val="clear" w:color="auto" w:fill="F5F8FB"/>
-        <w:spacing w:before="0" w:after="80"/>
-        <w:ind w:left="240"/>
-        <w:rPr/>
-      </w:pPr>
-      <w:r>
-        <w:rPr>
-          <w:rFonts w:eastAsia="JetBrains Mono" w:cs="JetBrains Mono" w:ascii="JetBrains Mono" w:hAnsi="JetBrains Mono"/>
-          <w:color w:val="123A5F"/>
-          <w:sz w:val="18"/>
-          <w:szCs w:val="18"/>
-        </w:rPr>
-        <w:t>curl -fsSL https://get.docker.com -o get-docker.sh &amp;&amp; sudo sh get-docker.sh</w:t>
-      </w:r>
-    </w:p>
-    <w:p>
-      <w:pPr>
-        <w:pStyle w:val="Normal"/>
-        <w:pBdr>
-          <w:left w:val="single" w:sz="12" w:space="8" w:color="1876C6"/>
-        </w:pBdr>
-        <w:shd w:val="clear" w:color="auto" w:fill="F5F8FB"/>
-        <w:spacing w:before="0" w:after="80"/>
-        <w:ind w:left="240"/>
-        <w:rPr/>
-      </w:pPr>
-      <w:r>
-        <w:rPr>
-          <w:rFonts w:eastAsia="JetBrains Mono" w:cs="JetBrains Mono" w:ascii="JetBrains Mono" w:hAnsi="JetBrains Mono"/>
-          <w:color w:val="123A5F"/>
-          <w:sz w:val="18"/>
-          <w:szCs w:val="18"/>
-        </w:rPr>
-        <w:t>sudo usermod -aG docker $USER &amp;&amp; sudo systemctl enable docker      # log out and back in</w:t>
-      </w:r>
-    </w:p>
-    <w:p>
-      <w:pPr>
-        <w:pStyle w:val="Heading2"/>
-        <w:keepNext w:val="true"/>
-        <w:spacing w:before="320" w:after="120"/>
-        <w:rPr/>
-      </w:pPr>
-      <w:bookmarkStart w:id="15" w:name="__RefHeading___Toc1281_2642403109"/>
-      <w:bookmarkEnd w:id="15"/>
-      <w:r>
-        <w:rPr>
-          <w:rFonts w:eastAsia="Montserrat" w:cs="Montserrat"/>
-          <w:b/>
-          <w:bCs/>
-          <w:color w:val="123A5F"/>
-          <w:sz w:val="32"/>
-          <w:szCs w:val="32"/>
-        </w:rPr>
-        <w:t>6.2 Install</w:t>
-      </w:r>
-    </w:p>
-    <w:p>
-      <w:pPr>
-        <w:pStyle w:val="Normal"/>
-        <w:pBdr>
-          <w:left w:val="single" w:sz="12" w:space="8" w:color="1876C6"/>
-        </w:pBdr>
-        <w:shd w:val="clear" w:color="auto" w:fill="F5F8FB"/>
-        <w:spacing w:before="0" w:after="80"/>
-        <w:ind w:left="240"/>
-        <w:rPr/>
-      </w:pPr>
-      <w:r>
-        <w:rPr>
-          <w:rFonts w:eastAsia="JetBrains Mono" w:cs="JetBrains Mono" w:ascii="JetBrains Mono" w:hAnsi="JetBrains Mono"/>
-          <w:color w:val="123A5F"/>
-          <w:sz w:val="18"/>
-          <w:szCs w:val="18"/>
-        </w:rPr>
-        <w:t># from your laptop</w:t>
-      </w:r>
-    </w:p>
-    <w:p>
-      <w:pPr>
-        <w:pStyle w:val="Normal"/>
-        <w:pBdr>
-          <w:left w:val="single" w:sz="12" w:space="8" w:color="1876C6"/>
-        </w:pBdr>
-        <w:shd w:val="clear" w:color="auto" w:fill="F5F8FB"/>
-        <w:spacing w:before="0" w:after="80"/>
-        <w:ind w:left="240"/>
-        <w:rPr/>
-      </w:pPr>
-      <w:r>
-        <w:rPr>
-          <w:rFonts w:eastAsia="JetBrains Mono" w:cs="JetBrains Mono" w:ascii="JetBrains Mono" w:hAnsi="JetBrains Mono"/>
-          <w:color w:val="123A5F"/>
-          <w:sz w:val="18"/>
-          <w:szCs w:val="18"/>
-        </w:rPr>
-        <w:t>scp CortexSkills-docker-1.15.0.zip user@skills.yourdomain.com:/tmp/</w:t>
-      </w:r>
-    </w:p>
-    <w:p>
-      <w:pPr>
-        <w:pStyle w:val="Normal"/>
-        <w:pBdr>
-          <w:left w:val="single" w:sz="12" w:space="8" w:color="1876C6"/>
-        </w:pBdr>
-        <w:shd w:val="clear" w:color="auto" w:fill="F5F8FB"/>
-        <w:spacing w:before="0" w:after="80"/>
-        <w:ind w:left="240"/>
-        <w:rPr/>
-      </w:pPr>
-      <w:r>
-        <w:rPr>
-          <w:rFonts w:eastAsia="JetBrains Mono" w:cs="JetBrains Mono" w:ascii="JetBrains Mono" w:hAnsi="JetBrains Mono"/>
-          <w:color w:val="123A5F"/>
-          <w:sz w:val="18"/>
-          <w:szCs w:val="18"/>
-        </w:rPr>
-        <w:t># on the VPS</w:t>
-      </w:r>
-    </w:p>
-    <w:p>
-      <w:pPr>
-        <w:pStyle w:val="Normal"/>
-        <w:pBdr>
-          <w:left w:val="single" w:sz="12" w:space="8" w:color="1876C6"/>
-        </w:pBdr>
-        <w:shd w:val="clear" w:color="auto" w:fill="F5F8FB"/>
-        <w:spacing w:before="0" w:after="80"/>
-        <w:ind w:left="240"/>
-        <w:rPr/>
-      </w:pPr>
-      <w:r>
-        <w:rPr>
-          <w:rFonts w:eastAsia="JetBrains Mono" w:cs="JetBrains Mono" w:ascii="JetBrains Mono" w:hAnsi="JetBrains Mono"/>
-          <w:color w:val="123A5F"/>
-          <w:sz w:val="18"/>
-          <w:szCs w:val="18"/>
-        </w:rPr>
-        <w:t>sudo mkdir -p /opt/cortexskills &amp;&amp; sudo chown $USER /opt/cortexskills &amp;&amp; cd /opt/cortexskills</w:t>
-      </w:r>
-    </w:p>
-    <w:p>
-      <w:pPr>
-        <w:pStyle w:val="Normal"/>
-        <w:pBdr>
-          <w:left w:val="single" w:sz="12" w:space="8" w:color="1876C6"/>
-        </w:pBdr>
-        <w:shd w:val="clear" w:color="auto" w:fill="F5F8FB"/>
-        <w:spacing w:before="0" w:after="80"/>
-        <w:ind w:left="240"/>
-        <w:rPr/>
-      </w:pPr>
-      <w:r>
-        <w:rPr>
-          <w:rFonts w:eastAsia="JetBrains Mono" w:cs="JetBrains Mono" w:ascii="JetBrains Mono" w:hAnsi="JetBrains Mono"/>
-          <w:color w:val="123A5F"/>
-          <w:sz w:val="18"/>
-          <w:szCs w:val="18"/>
-        </w:rPr>
-        <w:t>unzip /tmp/CortexSkills-docker-1.15.0.zip &amp;&amp; cd CortexSkills-docker-1.15.0</w:t>
-      </w:r>
-    </w:p>
-    <w:p>
-      <w:pPr>
-        <w:pStyle w:val="Normal"/>
-        <w:pBdr>
-          <w:left w:val="single" w:sz="12" w:space="8" w:color="1876C6"/>
-        </w:pBdr>
-        <w:shd w:val="clear" w:color="auto" w:fill="F5F8FB"/>
-        <w:spacing w:before="0" w:after="80"/>
-        <w:ind w:left="240"/>
-        <w:rPr/>
-      </w:pPr>
-      <w:r>
-        <w:rPr>
-          <w:rFonts w:eastAsia="JetBrains Mono" w:cs="JetBrains Mono" w:ascii="JetBrains Mono" w:hAnsi="JetBrains Mono"/>
-          <w:color w:val="123A5F"/>
-          <w:sz w:val="18"/>
-          <w:szCs w:val="18"/>
-        </w:rPr>
-        <w:t>docker build -t cortexskills:1.15.0 .            # or: docker load -i cortexskills-image-1.15.0.tar.gz</w:t>
-      </w:r>
-    </w:p>
-    <w:p>
-      <w:pPr>
-        <w:pStyle w:val="Normal"/>
-        <w:pBdr>
-          <w:left w:val="single" w:sz="12" w:space="8" w:color="1876C6"/>
-        </w:pBdr>
-        <w:shd w:val="clear" w:color="auto" w:fill="F5F8FB"/>
-        <w:spacing w:before="0" w:after="80"/>
-        <w:ind w:left="240"/>
-        <w:rPr/>
-      </w:pPr>
-      <w:r>
-        <w:rPr>
-          <w:rFonts w:eastAsia="JetBrains Mono" w:cs="JetBrains Mono" w:ascii="JetBrains Mono" w:hAnsi="JetBrains Mono"/>
-          <w:color w:val="123A5F"/>
-          <w:sz w:val="18"/>
-          <w:szCs w:val="18"/>
-        </w:rPr>
-        <w:t>cp env.example .env &amp;&amp; chmod 600 .env &amp;&amp; nano .env</w:t>
+        <w:t>Use it for a hosted pilot or demonstration reachable over the Internet, for example on a HeberJahiz Cloud 2 VPS (2 vCores, 4 GB RAM, 25 GB) with Ubuntu 24.04. The editor runtime is the same image as the customers’ one, packaged with HTTPS (Caddy) and four scripts — install, licence, backup, update. The private key and the signing tool stay on your laptop.</w:t>
       </w:r>
     </w:p>
     <w:tbl>
@@ -4700,10 +4480,10 @@
                 <w:b/>
                 <w:bCs/>
                 <w:color w:val="FFFFFF"/>
-                <w:sz w:val="18"/>
-                <w:szCs w:val="18"/>
-              </w:rPr>
-              <w:t>Setting</w:t>
+                <w:sz w:val="17"/>
+                <w:szCs w:val="17"/>
+              </w:rPr>
+              <w:t>In CortexSkills-editor-runtime-linux-1.15.0.zip</w:t>
             </w:r>
           </w:p>
         </w:tc>
@@ -4730,10 +4510,10 @@
                 <w:b/>
                 <w:bCs/>
                 <w:color w:val="FFFFFF"/>
-                <w:sz w:val="18"/>
-                <w:szCs w:val="18"/>
-              </w:rPr>
-              <w:t>Value on the VPS</w:t>
+                <w:sz w:val="17"/>
+                <w:szCs w:val="17"/>
+              </w:rPr>
+              <w:t>Role</w:t>
             </w:r>
           </w:p>
         </w:tc>
@@ -4765,10 +4545,10 @@
                 <w:b w:val="false"/>
                 <w:bCs w:val="false"/>
                 <w:color w:val="2C3E50"/>
-                <w:sz w:val="18"/>
-                <w:szCs w:val="18"/>
-              </w:rPr>
-              <w:t>PUBLIC_URL, CORS_ORIGIN</w:t>
+                <w:sz w:val="17"/>
+                <w:szCs w:val="17"/>
+              </w:rPr>
+              <w:t>install.sh</w:t>
             </w:r>
           </w:p>
         </w:tc>
@@ -4795,10 +4575,10 @@
                 <w:b w:val="false"/>
                 <w:bCs w:val="false"/>
                 <w:color w:val="2C3E50"/>
-                <w:sz w:val="18"/>
-                <w:szCs w:val="18"/>
-              </w:rPr>
-              <w:t>https://skills.yourdomain.com</w:t>
+                <w:sz w:val="17"/>
+                <w:szCs w:val="17"/>
+              </w:rPr>
+              <w:t>Checks Docker and the public key, writes .env with generated secrets, builds (or loads) the image, starts, waits until healthy, then removes the administrator password from .env.</w:t>
             </w:r>
           </w:p>
         </w:tc>
@@ -4830,10 +4610,10 @@
                 <w:b w:val="false"/>
                 <w:bCs w:val="false"/>
                 <w:color w:val="2C3E50"/>
-                <w:sz w:val="18"/>
-                <w:szCs w:val="18"/>
-              </w:rPr>
-              <w:t>DOMAIN</w:t>
+                <w:sz w:val="17"/>
+                <w:szCs w:val="17"/>
+              </w:rPr>
+              <w:t>licence.sh</w:t>
             </w:r>
           </w:p>
         </w:tc>
@@ -4860,10 +4640,10 @@
                 <w:b w:val="false"/>
                 <w:bCs w:val="false"/>
                 <w:color w:val="2C3E50"/>
-                <w:sz w:val="18"/>
-                <w:szCs w:val="18"/>
-              </w:rPr>
-              <w:t>skills.yourdomain.com</w:t>
+                <w:sz w:val="17"/>
+                <w:szCs w:val="17"/>
+              </w:rPr>
+              <w:t>create-org, list, request &lt;domain&gt;, install &lt;file.lic&gt; — the organization and licence commands in one place.</w:t>
             </w:r>
           </w:p>
         </w:tc>
@@ -4895,10 +4675,10 @@
                 <w:b w:val="false"/>
                 <w:bCs w:val="false"/>
                 <w:color w:val="2C3E50"/>
-                <w:sz w:val="18"/>
-                <w:szCs w:val="18"/>
-              </w:rPr>
-              <w:t>JWT_SECRET, CHANNEL_SECRET_KEY</w:t>
+                <w:sz w:val="17"/>
+                <w:szCs w:val="17"/>
+              </w:rPr>
+              <w:t>backup.sh</w:t>
             </w:r>
           </w:p>
         </w:tc>
@@ -4925,10 +4705,10 @@
                 <w:b w:val="false"/>
                 <w:bCs w:val="false"/>
                 <w:color w:val="2C3E50"/>
-                <w:sz w:val="18"/>
-                <w:szCs w:val="18"/>
-              </w:rPr>
-              <w:t>Two different values of openssl rand -base64 48 | tr -d "\n=+/"</w:t>
+                <w:sz w:val="17"/>
+                <w:szCs w:val="17"/>
+              </w:rPr>
+              <w:t>Backup copied out of the container (database backups, attached files, licence) into /opt/cortexskills-backups/&lt;date&gt;, kept 30 days; OFFSITE=user@host:/path also sends it to another machine.</w:t>
             </w:r>
           </w:p>
         </w:tc>
@@ -4960,10 +4740,10 @@
                 <w:b w:val="false"/>
                 <w:bCs w:val="false"/>
                 <w:color w:val="2C3E50"/>
-                <w:sz w:val="18"/>
-                <w:szCs w:val="18"/>
-              </w:rPr>
-              <w:t>ADMIN_EMAIL, ADMIN_NAME, ADMIN_PASSWORD</w:t>
+                <w:sz w:val="17"/>
+                <w:szCs w:val="17"/>
+              </w:rPr>
+              <w:t>update.sh</w:t>
             </w:r>
           </w:p>
         </w:tc>
@@ -4990,10 +4770,10 @@
                 <w:b w:val="false"/>
                 <w:bCs w:val="false"/>
                 <w:color w:val="2C3E50"/>
-                <w:sz w:val="18"/>
-                <w:szCs w:val="18"/>
-              </w:rPr>
-              <w:t>Your platform administrator (remove the password after the first start).</w:t>
+                <w:sz w:val="17"/>
+                <w:szCs w:val="17"/>
+              </w:rPr>
+              <w:t>From the folder of a new release: backup, copy of .env, licences and public key from the current folder, new image, restart on the same data.</w:t>
             </w:r>
           </w:p>
         </w:tc>
@@ -5025,10 +4805,10 @@
                 <w:b w:val="false"/>
                 <w:bCs w:val="false"/>
                 <w:color w:val="2C3E50"/>
-                <w:sz w:val="18"/>
-                <w:szCs w:val="18"/>
-              </w:rPr>
-              <w:t>SMTP_*</w:t>
+                <w:sz w:val="17"/>
+                <w:szCs w:val="17"/>
+              </w:rPr>
+              <w:t>docker-compose.yml, Caddyfile, Dockerfile, app/</w:t>
             </w:r>
           </w:p>
         </w:tc>
@@ -5055,95 +4835,15 @@
                 <w:b w:val="false"/>
                 <w:bCs w:val="false"/>
                 <w:color w:val="2C3E50"/>
-                <w:sz w:val="18"/>
-                <w:szCs w:val="18"/>
-              </w:rPr>
-              <w:t>Your outgoing mail account, so invitations and reminders really leave.</w:t>
+                <w:sz w:val="17"/>
+                <w:szCs w:val="17"/>
+              </w:rPr>
+              <w:t>The application and its HTTPS front end (profile https, on when the domain is not localhost).</w:t>
             </w:r>
           </w:p>
         </w:tc>
       </w:tr>
     </w:tbl>
-    <w:p>
-      <w:pPr>
-        <w:pStyle w:val="Normal"/>
-        <w:pBdr>
-          <w:left w:val="single" w:sz="12" w:space="8" w:color="1876C6"/>
-        </w:pBdr>
-        <w:shd w:val="clear" w:color="auto" w:fill="F5F8FB"/>
-        <w:spacing w:before="0" w:after="80"/>
-        <w:ind w:left="240"/>
-        <w:rPr/>
-      </w:pPr>
-      <w:r>
-        <w:rPr>
-          <w:rFonts w:eastAsia="JetBrains Mono" w:cs="JetBrains Mono" w:ascii="JetBrains Mono" w:hAnsi="JetBrains Mono"/>
-          <w:color w:val="123A5F"/>
-          <w:sz w:val="18"/>
-          <w:szCs w:val="18"/>
-        </w:rPr>
-        <w:t>docker compose -f docker-compose.yml -f compose.https.yml up -d</w:t>
-      </w:r>
-    </w:p>
-    <w:p>
-      <w:pPr>
-        <w:pStyle w:val="Normal"/>
-        <w:pBdr>
-          <w:left w:val="single" w:sz="12" w:space="8" w:color="1876C6"/>
-        </w:pBdr>
-        <w:shd w:val="clear" w:color="auto" w:fill="F5F8FB"/>
-        <w:spacing w:before="0" w:after="80"/>
-        <w:ind w:left="240"/>
-        <w:rPr/>
-      </w:pPr>
-      <w:r>
-        <w:rPr>
-          <w:rFonts w:eastAsia="JetBrains Mono" w:cs="JetBrains Mono" w:ascii="JetBrains Mono" w:hAnsi="JetBrains Mono"/>
-          <w:color w:val="123A5F"/>
-          <w:sz w:val="18"/>
-          <w:szCs w:val="18"/>
-        </w:rPr>
-        <w:t>docker compose logs -f cortexskills          # wait for "CortexSkills API is running"</w:t>
-      </w:r>
-    </w:p>
-    <w:p>
-      <w:pPr>
-        <w:pStyle w:val="Normal"/>
-        <w:pBdr>
-          <w:left w:val="single" w:sz="12" w:space="8" w:color="1876C6"/>
-        </w:pBdr>
-        <w:shd w:val="clear" w:color="auto" w:fill="F5F8FB"/>
-        <w:spacing w:before="0" w:after="80"/>
-        <w:ind w:left="240"/>
-        <w:rPr/>
-      </w:pPr>
-      <w:r>
-        <w:rPr>
-          <w:rFonts w:eastAsia="JetBrains Mono" w:cs="JetBrains Mono" w:ascii="JetBrains Mono" w:hAnsi="JetBrains Mono"/>
-          <w:color w:val="123A5F"/>
-          <w:sz w:val="18"/>
-          <w:szCs w:val="18"/>
-        </w:rPr>
-        <w:t>curl -s https://skills.yourdomain.com/api/health</w:t>
-      </w:r>
-    </w:p>
-    <w:p>
-      <w:pPr>
-        <w:pStyle w:val="Normal"/>
-        <w:spacing w:lineRule="auto" w:line="288" w:before="0" w:after="160"/>
-        <w:jc w:val="left"/>
-        <w:rPr/>
-      </w:pPr>
-      <w:r>
-        <w:rPr>
-          <w:rFonts w:eastAsia="Open Sans" w:cs="Open Sans"/>
-          <w:color w:val="2C3E50"/>
-          <w:sz w:val="20"/>
-          <w:szCs w:val="20"/>
-        </w:rPr>
-        <w:t>Caddy obtains the certificate at the first request (a few seconds). Then remove ADMIN_PASSWORD from .env and run the same up -d command again. Tip: define an alias to type less — alias csk="docker compose -f docker-compose.yml -f compose.https.yml".</w:t>
-      </w:r>
-    </w:p>
     <w:p>
       <w:pPr>
         <w:pStyle w:val="Heading2"/>
@@ -5151,8 +4851,8 @@
         <w:spacing w:before="320" w:after="120"/>
         <w:rPr/>
       </w:pPr>
-      <w:bookmarkStart w:id="16" w:name="__RefHeading___Toc1283_2642403109"/>
-      <w:bookmarkEnd w:id="16"/>
+      <w:bookmarkStart w:id="14" w:name="__RefHeading___Toc598_3511503178"/>
+      <w:bookmarkEnd w:id="14"/>
       <w:r>
         <w:rPr>
           <w:rFonts w:eastAsia="Montserrat" w:cs="Montserrat"/>
@@ -5162,113 +4862,7 @@
           <w:sz w:val="32"/>
           <w:szCs w:val="32"/>
         </w:rPr>
-        <w:t>6.3 Run it</w:t>
-      </w:r>
-    </w:p>
-    <w:p>
-      <w:pPr>
-        <w:pStyle w:val="ListParagraph"/>
-        <w:numPr>
-          <w:ilvl w:val="0"/>
-          <w:numId w:val="3"/>
-        </w:numPr>
-        <w:spacing w:lineRule="auto" w:line="288" w:before="0" w:after="80"/>
-        <w:rPr/>
-      </w:pPr>
-      <w:r>
-        <w:rPr>
-          <w:rFonts w:eastAsia="Open Sans" w:cs="Open Sans"/>
-          <w:color w:val="2C3E50"/>
-          <w:sz w:val="22"/>
-          <w:szCs w:val="22"/>
-        </w:rPr>
-        <w:t>Backups off the VPS every night — on your laptop or another server, for example with cron on the VPS: docker compose exec -T cortexskills cortexskills-admin backup, then docker compose cp cortexskills:/data/backups /opt/cortexskills/backups and rsync that folder to your backup host.</w:t>
-      </w:r>
-    </w:p>
-    <w:p>
-      <w:pPr>
-        <w:pStyle w:val="ListParagraph"/>
-        <w:numPr>
-          <w:ilvl w:val="0"/>
-          <w:numId w:val="1"/>
-        </w:numPr>
-        <w:spacing w:lineRule="auto" w:line="288" w:before="0" w:after="80"/>
-        <w:rPr/>
-      </w:pPr>
-      <w:r>
-        <w:rPr>
-          <w:rFonts w:eastAsia="Open Sans" w:cs="Open Sans"/>
-          <w:color w:val="2C3E50"/>
-          <w:sz w:val="22"/>
-          <w:szCs w:val="22"/>
-        </w:rPr>
-        <w:t>Updates: same procedure as the customers (Customer guide, section 10.4).</w:t>
-      </w:r>
-    </w:p>
-    <w:p>
-      <w:pPr>
-        <w:pStyle w:val="ListParagraph"/>
-        <w:numPr>
-          <w:ilvl w:val="0"/>
-          <w:numId w:val="1"/>
-        </w:numPr>
-        <w:spacing w:lineRule="auto" w:line="288" w:before="0" w:after="80"/>
-        <w:rPr/>
-      </w:pPr>
-      <w:r>
-        <w:rPr>
-          <w:rFonts w:eastAsia="Open Sans" w:cs="Open Sans"/>
-          <w:color w:val="2C3E50"/>
-          <w:sz w:val="22"/>
-          <w:szCs w:val="22"/>
-        </w:rPr>
-        <w:t>Several customer organizations can be activated on the same VPS: one org-create and one licence each; the licence file of the installation keeps one entry per organization.</w:t>
-      </w:r>
-    </w:p>
-    <w:p>
-      <w:pPr>
-        <w:pStyle w:val="ListParagraph"/>
-        <w:numPr>
-          <w:ilvl w:val="0"/>
-          <w:numId w:val="1"/>
-        </w:numPr>
-        <w:spacing w:lineRule="auto" w:line="288" w:before="0" w:after="80"/>
-        <w:rPr/>
-      </w:pPr>
-      <w:r>
-        <w:rPr>
-          <w:rFonts w:eastAsia="Open Sans" w:cs="Open Sans"/>
-          <w:color w:val="2C3E50"/>
-          <w:sz w:val="22"/>
-          <w:szCs w:val="22"/>
-        </w:rPr>
-        <w:t>Cloud 2 sizing fits a pilot of up to about 100 active users; above, move to 4 vCPU / 8 GB.</w:t>
-      </w:r>
-      <w:r>
-        <w:br w:type="page"/>
-      </w:r>
-    </w:p>
-    <w:p>
-      <w:pPr>
-        <w:pStyle w:val="Heading1"/>
-        <w:pBdr>
-          <w:bottom w:val="single" w:sz="6" w:space="6" w:color="E1E8F0"/>
-        </w:pBdr>
-        <w:spacing w:before="0" w:after="240"/>
-        <w:rPr/>
-      </w:pPr>
-      <w:bookmarkStart w:id="17" w:name="__RefHeading___Toc1285_2642403109"/>
-      <w:bookmarkEnd w:id="17"/>
-      <w:r>
-        <w:rPr>
-          <w:rFonts w:eastAsia="Montserrat" w:cs="Montserrat"/>
-          <w:b/>
-          <w:bCs/>
-          <w:color w:val="123A5F"/>
-          <w:sz w:val="40"/>
-          <w:szCs w:val="40"/>
-        </w:rPr>
-        <w:t>7. Scenario 2 — Activate the licence of a customer on the VPS</w:t>
+        <w:t>6.1 Prepare the VPS (once)</w:t>
       </w:r>
     </w:p>
     <w:p>
@@ -5285,94 +4879,11 @@
       <w:r>
         <w:rPr>
           <w:rFonts w:eastAsia="Open Sans" w:cs="Open Sans"/>
-          <w:b/>
-          <w:bCs/>
           <w:color w:val="2C3E50"/>
           <w:sz w:val="22"/>
           <w:szCs w:val="22"/>
         </w:rPr>
-        <w:t xml:space="preserve">Create the organization on the VPS </w:t>
-      </w:r>
-      <w:r>
-        <w:rPr>
-          <w:rFonts w:eastAsia="Open Sans" w:cs="Open Sans"/>
-          <w:color w:val="2C3E50"/>
-          <w:sz w:val="22"/>
-          <w:szCs w:val="22"/>
-        </w:rPr>
-        <w:t>(in /opt/cortexskills/CortexSkills-docker-1.15.0):</w:t>
-      </w:r>
-    </w:p>
-    <w:p>
-      <w:pPr>
-        <w:pStyle w:val="Normal"/>
-        <w:pBdr>
-          <w:left w:val="single" w:sz="12" w:space="8" w:color="1876C6"/>
-        </w:pBdr>
-        <w:shd w:val="clear" w:color="auto" w:fill="F5F8FB"/>
-        <w:spacing w:before="0" w:after="80"/>
-        <w:ind w:left="240"/>
-        <w:rPr/>
-      </w:pPr>
-      <w:r>
-        <w:rPr>
-          <w:rFonts w:eastAsia="JetBrains Mono" w:cs="JetBrains Mono" w:ascii="JetBrains Mono" w:hAnsi="JetBrains Mono"/>
-          <w:color w:val="123A5F"/>
-          <w:sz w:val="18"/>
-          <w:szCs w:val="18"/>
-        </w:rPr>
-        <w:t>docker compose exec cortexskills cortexskills-admin org-create --name "Clinique Exemple" --domain clinique-exemple.ma \</w:t>
-      </w:r>
-    </w:p>
-    <w:p>
-      <w:pPr>
-        <w:pStyle w:val="Normal"/>
-        <w:pBdr>
-          <w:left w:val="single" w:sz="12" w:space="8" w:color="1876C6"/>
-        </w:pBdr>
-        <w:shd w:val="clear" w:color="auto" w:fill="F5F8FB"/>
-        <w:spacing w:before="0" w:after="80"/>
-        <w:ind w:left="240"/>
-        <w:rPr/>
-      </w:pPr>
-      <w:r>
-        <w:rPr>
-          <w:rFonts w:eastAsia="JetBrains Mono" w:cs="JetBrains Mono" w:ascii="JetBrains Mono" w:hAnsi="JetBrains Mono"/>
-          <w:color w:val="123A5F"/>
-          <w:sz w:val="18"/>
-          <w:szCs w:val="18"/>
-        </w:rPr>
-        <w:t xml:space="preserve">  </w:t>
-      </w:r>
-      <w:r>
-        <w:rPr>
-          <w:rFonts w:eastAsia="JetBrains Mono" w:cs="JetBrains Mono" w:ascii="JetBrains Mono" w:hAnsi="JetBrains Mono"/>
-          <w:color w:val="123A5F"/>
-          <w:sz w:val="18"/>
-          <w:szCs w:val="18"/>
-        </w:rPr>
-        <w:t>--admin-email admin@clinique-exemple.ma --admin-name "Admin Clinique" --admin-password 'Str0ng#Passw0rd2026' --lang fr</w:t>
-      </w:r>
-    </w:p>
-    <w:p>
-      <w:pPr>
-        <w:pStyle w:val="Normal"/>
-        <w:pBdr>
-          <w:left w:val="single" w:sz="12" w:space="8" w:color="1876C6"/>
-        </w:pBdr>
-        <w:shd w:val="clear" w:color="auto" w:fill="F5F8FB"/>
-        <w:spacing w:before="0" w:after="80"/>
-        <w:ind w:left="240"/>
-        <w:rPr/>
-      </w:pPr>
-      <w:r>
-        <w:rPr>
-          <w:rFonts w:eastAsia="JetBrains Mono" w:cs="JetBrains Mono" w:ascii="JetBrains Mono" w:hAnsi="JetBrains Mono"/>
-          <w:color w:val="123A5F"/>
-          <w:sz w:val="18"/>
-          <w:szCs w:val="18"/>
-        </w:rPr>
-        <w:t>docker compose exec cortexskills cortexskills-admin licence-request --org clinique-exemple.ma</w:t>
+        <w:t>Create a DNS record A: skills.yourdomain.com → public IP of the VPS.</w:t>
       </w:r>
     </w:p>
     <w:p>
@@ -5389,14 +4900,393 @@
       <w:r>
         <w:rPr>
           <w:rFonts w:eastAsia="Open Sans" w:cs="Open Sans"/>
-          <w:b/>
-          <w:bCs/>
           <w:color w:val="2C3E50"/>
           <w:sz w:val="22"/>
           <w:szCs w:val="22"/>
         </w:rPr>
-        <w:t xml:space="preserve">Sign on your laptop </w:t>
-      </w:r>
+        <w:t>Connect with SSH, create an administrator user, use SSH keys, and open only the needed ports:</w:t>
+      </w:r>
+    </w:p>
+    <w:p>
+      <w:pPr>
+        <w:pStyle w:val="Normal"/>
+        <w:pBdr>
+          <w:left w:val="single" w:sz="12" w:space="8" w:color="1876C6"/>
+        </w:pBdr>
+        <w:shd w:val="clear" w:color="auto" w:fill="F5F8FB"/>
+        <w:spacing w:before="0" w:after="80"/>
+        <w:ind w:left="240"/>
+        <w:rPr/>
+      </w:pPr>
+      <w:r>
+        <w:rPr>
+          <w:rFonts w:eastAsia="JetBrains Mono" w:cs="JetBrains Mono" w:ascii="JetBrains Mono" w:hAnsi="JetBrains Mono"/>
+          <w:color w:val="123A5F"/>
+          <w:sz w:val="18"/>
+          <w:szCs w:val="18"/>
+        </w:rPr>
+        <w:t>sudo apt update &amp;&amp; sudo apt -y upgrade &amp;&amp; sudo apt -y install unzip rsync</w:t>
+      </w:r>
+    </w:p>
+    <w:p>
+      <w:pPr>
+        <w:pStyle w:val="Normal"/>
+        <w:pBdr>
+          <w:left w:val="single" w:sz="12" w:space="8" w:color="1876C6"/>
+        </w:pBdr>
+        <w:shd w:val="clear" w:color="auto" w:fill="F5F8FB"/>
+        <w:spacing w:before="0" w:after="80"/>
+        <w:ind w:left="240"/>
+        <w:rPr/>
+      </w:pPr>
+      <w:r>
+        <w:rPr>
+          <w:rFonts w:eastAsia="JetBrains Mono" w:cs="JetBrains Mono" w:ascii="JetBrains Mono" w:hAnsi="JetBrains Mono"/>
+          <w:color w:val="123A5F"/>
+          <w:sz w:val="18"/>
+          <w:szCs w:val="18"/>
+        </w:rPr>
+        <w:t>sudo ufw allow OpenSSH &amp;&amp; sudo ufw allow 80/tcp &amp;&amp; sudo ufw allow 443/tcp &amp;&amp; sudo ufw enable</w:t>
+      </w:r>
+    </w:p>
+    <w:p>
+      <w:pPr>
+        <w:pStyle w:val="Normal"/>
+        <w:pBdr>
+          <w:left w:val="single" w:sz="12" w:space="8" w:color="1876C6"/>
+        </w:pBdr>
+        <w:shd w:val="clear" w:color="auto" w:fill="F5F8FB"/>
+        <w:spacing w:before="0" w:after="80"/>
+        <w:ind w:left="240"/>
+        <w:rPr/>
+      </w:pPr>
+      <w:r>
+        <w:rPr>
+          <w:rFonts w:eastAsia="JetBrains Mono" w:cs="JetBrains Mono" w:ascii="JetBrains Mono" w:hAnsi="JetBrains Mono"/>
+          <w:color w:val="123A5F"/>
+          <w:sz w:val="18"/>
+          <w:szCs w:val="18"/>
+        </w:rPr>
+        <w:t>curl -fsSL https://get.docker.com -o get-docker.sh &amp;&amp; sudo sh get-docker.sh</w:t>
+      </w:r>
+    </w:p>
+    <w:p>
+      <w:pPr>
+        <w:pStyle w:val="Normal"/>
+        <w:pBdr>
+          <w:left w:val="single" w:sz="12" w:space="8" w:color="1876C6"/>
+        </w:pBdr>
+        <w:shd w:val="clear" w:color="auto" w:fill="F5F8FB"/>
+        <w:spacing w:before="0" w:after="80"/>
+        <w:ind w:left="240"/>
+        <w:rPr/>
+      </w:pPr>
+      <w:r>
+        <w:rPr>
+          <w:rFonts w:eastAsia="JetBrains Mono" w:cs="JetBrains Mono" w:ascii="JetBrains Mono" w:hAnsi="JetBrains Mono"/>
+          <w:color w:val="123A5F"/>
+          <w:sz w:val="18"/>
+          <w:szCs w:val="18"/>
+        </w:rPr>
+        <w:t>sudo usermod -aG docker $USER &amp;&amp; sudo systemctl enable docker      # log out and back in</w:t>
+      </w:r>
+    </w:p>
+    <w:p>
+      <w:pPr>
+        <w:pStyle w:val="Heading2"/>
+        <w:keepNext w:val="true"/>
+        <w:spacing w:before="320" w:after="120"/>
+        <w:rPr/>
+      </w:pPr>
+      <w:bookmarkStart w:id="15" w:name="__RefHeading___Toc600_3511503178"/>
+      <w:bookmarkEnd w:id="15"/>
+      <w:r>
+        <w:rPr>
+          <w:rFonts w:eastAsia="Montserrat" w:cs="Montserrat"/>
+          <w:b/>
+          <w:bCs/>
+          <w:color w:val="123A5F"/>
+          <w:sz w:val="32"/>
+          <w:szCs w:val="32"/>
+        </w:rPr>
+        <w:t>6.2 Install</w:t>
+      </w:r>
+    </w:p>
+    <w:p>
+      <w:pPr>
+        <w:pStyle w:val="Normal"/>
+        <w:pBdr>
+          <w:left w:val="single" w:sz="12" w:space="8" w:color="1876C6"/>
+        </w:pBdr>
+        <w:shd w:val="clear" w:color="auto" w:fill="F5F8FB"/>
+        <w:spacing w:before="0" w:after="80"/>
+        <w:ind w:left="240"/>
+        <w:rPr/>
+      </w:pPr>
+      <w:r>
+        <w:rPr>
+          <w:rFonts w:eastAsia="JetBrains Mono" w:cs="JetBrains Mono" w:ascii="JetBrains Mono" w:hAnsi="JetBrains Mono"/>
+          <w:color w:val="123A5F"/>
+          <w:sz w:val="18"/>
+          <w:szCs w:val="18"/>
+        </w:rPr>
+        <w:t># from your laptop</w:t>
+      </w:r>
+    </w:p>
+    <w:p>
+      <w:pPr>
+        <w:pStyle w:val="Normal"/>
+        <w:pBdr>
+          <w:left w:val="single" w:sz="12" w:space="8" w:color="1876C6"/>
+        </w:pBdr>
+        <w:shd w:val="clear" w:color="auto" w:fill="F5F8FB"/>
+        <w:spacing w:before="0" w:after="80"/>
+        <w:ind w:left="240"/>
+        <w:rPr/>
+      </w:pPr>
+      <w:r>
+        <w:rPr>
+          <w:rFonts w:eastAsia="JetBrains Mono" w:cs="JetBrains Mono" w:ascii="JetBrains Mono" w:hAnsi="JetBrains Mono"/>
+          <w:color w:val="123A5F"/>
+          <w:sz w:val="18"/>
+          <w:szCs w:val="18"/>
+        </w:rPr>
+        <w:t>scp CortexSkills-editor-runtime-linux-1.15.0.zip ~/CortexSkills-signing/server/tools/keys/vendor-public.pem user@skills.yourdomain.com:/tmp/</w:t>
+      </w:r>
+    </w:p>
+    <w:p>
+      <w:pPr>
+        <w:pStyle w:val="Normal"/>
+        <w:pBdr>
+          <w:left w:val="single" w:sz="12" w:space="8" w:color="1876C6"/>
+        </w:pBdr>
+        <w:shd w:val="clear" w:color="auto" w:fill="F5F8FB"/>
+        <w:spacing w:before="0" w:after="80"/>
+        <w:ind w:left="240"/>
+        <w:rPr/>
+      </w:pPr>
+      <w:r>
+        <w:rPr>
+          <w:rFonts w:eastAsia="JetBrains Mono" w:cs="JetBrains Mono" w:ascii="JetBrains Mono" w:hAnsi="JetBrains Mono"/>
+          <w:color w:val="123A5F"/>
+          <w:sz w:val="18"/>
+          <w:szCs w:val="18"/>
+        </w:rPr>
+        <w:t># on the VPS</w:t>
+      </w:r>
+    </w:p>
+    <w:p>
+      <w:pPr>
+        <w:pStyle w:val="Normal"/>
+        <w:pBdr>
+          <w:left w:val="single" w:sz="12" w:space="8" w:color="1876C6"/>
+        </w:pBdr>
+        <w:shd w:val="clear" w:color="auto" w:fill="F5F8FB"/>
+        <w:spacing w:before="0" w:after="80"/>
+        <w:ind w:left="240"/>
+        <w:rPr/>
+      </w:pPr>
+      <w:r>
+        <w:rPr>
+          <w:rFonts w:eastAsia="JetBrains Mono" w:cs="JetBrains Mono" w:ascii="JetBrains Mono" w:hAnsi="JetBrains Mono"/>
+          <w:color w:val="123A5F"/>
+          <w:sz w:val="18"/>
+          <w:szCs w:val="18"/>
+        </w:rPr>
+        <w:t>sudo mkdir -p /opt/cortexskills &amp;&amp; sudo chown $USER /opt/cortexskills &amp;&amp; cd /opt/cortexskills</w:t>
+      </w:r>
+    </w:p>
+    <w:p>
+      <w:pPr>
+        <w:pStyle w:val="Normal"/>
+        <w:pBdr>
+          <w:left w:val="single" w:sz="12" w:space="8" w:color="1876C6"/>
+        </w:pBdr>
+        <w:shd w:val="clear" w:color="auto" w:fill="F5F8FB"/>
+        <w:spacing w:before="0" w:after="80"/>
+        <w:ind w:left="240"/>
+        <w:rPr/>
+      </w:pPr>
+      <w:r>
+        <w:rPr>
+          <w:rFonts w:eastAsia="JetBrains Mono" w:cs="JetBrains Mono" w:ascii="JetBrains Mono" w:hAnsi="JetBrains Mono"/>
+          <w:color w:val="123A5F"/>
+          <w:sz w:val="18"/>
+          <w:szCs w:val="18"/>
+        </w:rPr>
+        <w:t>unzip /tmp/CortexSkills-editor-runtime-linux-1.15.0.zip</w:t>
+      </w:r>
+    </w:p>
+    <w:p>
+      <w:pPr>
+        <w:pStyle w:val="Normal"/>
+        <w:pBdr>
+          <w:left w:val="single" w:sz="12" w:space="8" w:color="1876C6"/>
+        </w:pBdr>
+        <w:shd w:val="clear" w:color="auto" w:fill="F5F8FB"/>
+        <w:spacing w:before="0" w:after="80"/>
+        <w:ind w:left="240"/>
+        <w:rPr/>
+      </w:pPr>
+      <w:r>
+        <w:rPr>
+          <w:rFonts w:eastAsia="JetBrains Mono" w:cs="JetBrains Mono" w:ascii="JetBrains Mono" w:hAnsi="JetBrains Mono"/>
+          <w:color w:val="123A5F"/>
+          <w:sz w:val="18"/>
+          <w:szCs w:val="18"/>
+        </w:rPr>
+        <w:t>ln -sfn CortexSkills-editor-runtime-linux-1.15.0 current &amp;&amp; cd current</w:t>
+      </w:r>
+    </w:p>
+    <w:p>
+      <w:pPr>
+        <w:pStyle w:val="Normal"/>
+        <w:pBdr>
+          <w:left w:val="single" w:sz="12" w:space="8" w:color="1876C6"/>
+        </w:pBdr>
+        <w:shd w:val="clear" w:color="auto" w:fill="F5F8FB"/>
+        <w:spacing w:before="0" w:after="80"/>
+        <w:ind w:left="240"/>
+        <w:rPr/>
+      </w:pPr>
+      <w:r>
+        <w:rPr>
+          <w:rFonts w:eastAsia="JetBrains Mono" w:cs="JetBrains Mono" w:ascii="JetBrains Mono" w:hAnsi="JetBrains Mono"/>
+          <w:color w:val="123A5F"/>
+          <w:sz w:val="18"/>
+          <w:szCs w:val="18"/>
+        </w:rPr>
+        <w:t>cp /tmp/vendor-public.pem .</w:t>
+      </w:r>
+    </w:p>
+    <w:p>
+      <w:pPr>
+        <w:pStyle w:val="Normal"/>
+        <w:pBdr>
+          <w:left w:val="single" w:sz="12" w:space="8" w:color="1876C6"/>
+        </w:pBdr>
+        <w:shd w:val="clear" w:color="auto" w:fill="F5F8FB"/>
+        <w:spacing w:before="0" w:after="80"/>
+        <w:ind w:left="240"/>
+        <w:rPr/>
+      </w:pPr>
+      <w:r>
+        <w:rPr>
+          <w:rFonts w:eastAsia="JetBrains Mono" w:cs="JetBrains Mono" w:ascii="JetBrains Mono" w:hAnsi="JetBrains Mono"/>
+          <w:color w:val="123A5F"/>
+          <w:sz w:val="18"/>
+          <w:szCs w:val="18"/>
+        </w:rPr>
+        <w:t>./install.sh</w:t>
+      </w:r>
+    </w:p>
+    <w:p>
+      <w:pPr>
+        <w:pStyle w:val="Normal"/>
+        <w:spacing w:lineRule="auto" w:line="288" w:before="0" w:after="160"/>
+        <w:jc w:val="left"/>
+        <w:rPr/>
+      </w:pPr>
+      <w:r>
+        <w:rPr>
+          <w:rFonts w:eastAsia="Open Sans" w:cs="Open Sans"/>
+          <w:color w:val="2C3E50"/>
+          <w:sz w:val="20"/>
+          <w:szCs w:val="20"/>
+        </w:rPr>
+        <w:t>install.sh asks three things: the domain (skills.yourdomain.com), the platform administrator e-mail and its password (12+ characters, upper and lower case, digit, symbol). It answers “CortexSkills is running: https://skills.yourdomain.com” when the application is healthy; Caddy obtains the certificate at the first visit. Without questions: DOMAIN=… ADMIN_EMAIL=… ADMIN_PASSWORD=… ./install.sh.</w:t>
+      </w:r>
+    </w:p>
+    <w:p>
+      <w:pPr>
+        <w:pStyle w:val="Normal"/>
+        <w:spacing w:lineRule="auto" w:line="288" w:before="0" w:after="160"/>
+        <w:jc w:val="left"/>
+        <w:rPr/>
+      </w:pPr>
+      <w:r>
+        <w:rPr>
+          <w:rFonts w:eastAsia="Open Sans" w:cs="Open Sans"/>
+          <w:color w:val="2C3E50"/>
+          <w:sz w:val="20"/>
+          <w:szCs w:val="20"/>
+        </w:rPr>
+        <w:t>Then fill the SMTP_* lines of .env with your outgoing mail account (so invitations and reminders really leave) and run docker compose up -d.</w:t>
+      </w:r>
+    </w:p>
+    <w:p>
+      <w:pPr>
+        <w:pStyle w:val="Heading2"/>
+        <w:keepNext w:val="true"/>
+        <w:spacing w:before="320" w:after="120"/>
+        <w:rPr/>
+      </w:pPr>
+      <w:bookmarkStart w:id="16" w:name="__RefHeading___Toc602_3511503178"/>
+      <w:bookmarkEnd w:id="16"/>
+      <w:r>
+        <w:rPr>
+          <w:rFonts w:eastAsia="Montserrat" w:cs="Montserrat"/>
+          <w:b/>
+          <w:bCs/>
+          <w:color w:val="123A5F"/>
+          <w:sz w:val="32"/>
+          <w:szCs w:val="32"/>
+        </w:rPr>
+        <w:t>6.3 Run it</w:t>
+      </w:r>
+    </w:p>
+    <w:p>
+      <w:pPr>
+        <w:pStyle w:val="Normal"/>
+        <w:pBdr>
+          <w:left w:val="single" w:sz="12" w:space="8" w:color="1876C6"/>
+        </w:pBdr>
+        <w:shd w:val="clear" w:color="auto" w:fill="F5F8FB"/>
+        <w:spacing w:before="0" w:after="80"/>
+        <w:ind w:left="240"/>
+        <w:rPr/>
+      </w:pPr>
+      <w:r>
+        <w:rPr>
+          <w:rFonts w:eastAsia="JetBrains Mono" w:cs="JetBrains Mono" w:ascii="JetBrains Mono" w:hAnsi="JetBrains Mono"/>
+          <w:color w:val="123A5F"/>
+          <w:sz w:val="18"/>
+          <w:szCs w:val="18"/>
+        </w:rPr>
+        <w:t>crontab -e     # add the line below: backup every night at 02:30, copied to another machine</w:t>
+      </w:r>
+    </w:p>
+    <w:p>
+      <w:pPr>
+        <w:pStyle w:val="Normal"/>
+        <w:pBdr>
+          <w:left w:val="single" w:sz="12" w:space="8" w:color="1876C6"/>
+        </w:pBdr>
+        <w:shd w:val="clear" w:color="auto" w:fill="F5F8FB"/>
+        <w:spacing w:before="0" w:after="80"/>
+        <w:ind w:left="240"/>
+        <w:rPr/>
+      </w:pPr>
+      <w:r>
+        <w:rPr>
+          <w:rFonts w:eastAsia="JetBrains Mono" w:cs="JetBrains Mono" w:ascii="JetBrains Mono" w:hAnsi="JetBrains Mono"/>
+          <w:color w:val="123A5F"/>
+          <w:sz w:val="18"/>
+          <w:szCs w:val="18"/>
+        </w:rPr>
+        <w:t>30 2 * * * OFFSITE=user@backuphost:/backups /opt/cortexskills/current/backup.sh &gt;&gt; $HOME/cortexskills-backup.log 2&gt;&amp;1</w:t>
+      </w:r>
+    </w:p>
+    <w:p>
+      <w:pPr>
+        <w:pStyle w:val="ListParagraph"/>
+        <w:numPr>
+          <w:ilvl w:val="0"/>
+          <w:numId w:val="3"/>
+        </w:numPr>
+        <w:spacing w:lineRule="auto" w:line="288" w:before="0" w:after="80"/>
+        <w:rPr/>
+      </w:pPr>
       <w:r>
         <w:rPr>
           <w:rFonts w:eastAsia="Open Sans" w:cs="Open Sans"/>
@@ -5404,7 +5294,93 @@
           <w:sz w:val="22"/>
           <w:szCs w:val="22"/>
         </w:rPr>
-        <w:t>(signing workspace) with the Organization ID printed, exactly as in section 5.2.</w:t>
+        <w:t>Update: unzip the new release in /opt/cortexskills, cd into it, run ./update.sh /opt/cortexskills/current, then ln -sfn &lt;new folder&gt; /opt/cortexskills/current.</w:t>
+      </w:r>
+    </w:p>
+    <w:p>
+      <w:pPr>
+        <w:pStyle w:val="ListParagraph"/>
+        <w:numPr>
+          <w:ilvl w:val="0"/>
+          <w:numId w:val="1"/>
+        </w:numPr>
+        <w:spacing w:lineRule="auto" w:line="288" w:before="0" w:after="80"/>
+        <w:rPr/>
+      </w:pPr>
+      <w:r>
+        <w:rPr>
+          <w:rFonts w:eastAsia="Open Sans" w:cs="Open Sans"/>
+          <w:color w:val="2C3E50"/>
+          <w:sz w:val="22"/>
+          <w:szCs w:val="22"/>
+        </w:rPr>
+        <w:t>Restore: docker compose stop, then docker compose run --rm --no-deps --entrypoint cortexskills-admin cortexskills restore &lt;file.db&gt;, then docker compose start.</w:t>
+      </w:r>
+    </w:p>
+    <w:p>
+      <w:pPr>
+        <w:pStyle w:val="ListParagraph"/>
+        <w:numPr>
+          <w:ilvl w:val="0"/>
+          <w:numId w:val="1"/>
+        </w:numPr>
+        <w:spacing w:lineRule="auto" w:line="288" w:before="0" w:after="80"/>
+        <w:rPr/>
+      </w:pPr>
+      <w:r>
+        <w:rPr>
+          <w:rFonts w:eastAsia="Open Sans" w:cs="Open Sans"/>
+          <w:color w:val="2C3E50"/>
+          <w:sz w:val="22"/>
+          <w:szCs w:val="22"/>
+        </w:rPr>
+        <w:t>Several customer organizations can be activated on the same VPS: one create-org and one licence each; the installation keeps one licence entry per organization.</w:t>
+      </w:r>
+    </w:p>
+    <w:p>
+      <w:pPr>
+        <w:pStyle w:val="ListParagraph"/>
+        <w:numPr>
+          <w:ilvl w:val="0"/>
+          <w:numId w:val="1"/>
+        </w:numPr>
+        <w:spacing w:lineRule="auto" w:line="288" w:before="0" w:after="80"/>
+        <w:rPr/>
+      </w:pPr>
+      <w:r>
+        <w:rPr>
+          <w:rFonts w:eastAsia="Open Sans" w:cs="Open Sans"/>
+          <w:color w:val="2C3E50"/>
+          <w:sz w:val="22"/>
+          <w:szCs w:val="22"/>
+        </w:rPr>
+        <w:t>Cloud 2 sizing fits a pilot of up to about 100 active users; above, move to 4 vCPU / 8 GB.</w:t>
+      </w:r>
+      <w:r>
+        <w:br w:type="page"/>
+      </w:r>
+    </w:p>
+    <w:p>
+      <w:pPr>
+        <w:pStyle w:val="Heading1"/>
+        <w:pBdr>
+          <w:bottom w:val="single" w:sz="6" w:space="6" w:color="E1E8F0"/>
+        </w:pBdr>
+        <w:spacing w:before="0" w:after="240"/>
+        <w:rPr/>
+      </w:pPr>
+      <w:bookmarkStart w:id="17" w:name="__RefHeading___Toc604_3511503178"/>
+      <w:bookmarkEnd w:id="17"/>
+      <w:r>
+        <w:rPr>
+          <w:rFonts w:eastAsia="Montserrat" w:cs="Montserrat"/>
+          <w:b/>
+          <w:bCs/>
+          <w:color w:val="123A5F"/>
+          <w:sz w:val="40"/>
+          <w:szCs w:val="40"/>
+        </w:rPr>
+        <w:t>7. Scenario 2 — Activate the licence of a customer on the VPS</w:t>
       </w:r>
     </w:p>
     <w:p>
@@ -5427,7 +5403,7 @@
           <w:sz w:val="22"/>
           <w:szCs w:val="22"/>
         </w:rPr>
-        <w:t xml:space="preserve">Copy the file to the VPS </w:t>
+        <w:t xml:space="preserve">Create the organization on the VPS </w:t>
       </w:r>
       <w:r>
         <w:rPr>
@@ -5436,7 +5412,7 @@
           <w:sz w:val="22"/>
           <w:szCs w:val="22"/>
         </w:rPr>
-        <w:t>into the licence/ folder of the bundle:</w:t>
+        <w:t>(in /opt/cortexskills/current):</w:t>
       </w:r>
     </w:p>
     <w:p>
@@ -5457,7 +5433,58 @@
           <w:sz w:val="18"/>
           <w:szCs w:val="18"/>
         </w:rPr>
-        <w:t>scp ~/licences/Clinique_Exemple.lic user@skills.yourdomain.com:/opt/cortexskills/CortexSkills-docker-1.15.0/licence/</w:t>
+        <w:t>./licence.sh create-org --name "Clinique Exemple" --domain clinique-exemple.ma \</w:t>
+      </w:r>
+    </w:p>
+    <w:p>
+      <w:pPr>
+        <w:pStyle w:val="Normal"/>
+        <w:pBdr>
+          <w:left w:val="single" w:sz="12" w:space="8" w:color="1876C6"/>
+        </w:pBdr>
+        <w:shd w:val="clear" w:color="auto" w:fill="F5F8FB"/>
+        <w:spacing w:before="0" w:after="80"/>
+        <w:ind w:left="240"/>
+        <w:rPr/>
+      </w:pPr>
+      <w:r>
+        <w:rPr>
+          <w:rFonts w:eastAsia="JetBrains Mono" w:cs="JetBrains Mono" w:ascii="JetBrains Mono" w:hAnsi="JetBrains Mono"/>
+          <w:color w:val="123A5F"/>
+          <w:sz w:val="18"/>
+          <w:szCs w:val="18"/>
+        </w:rPr>
+        <w:t xml:space="preserve">  </w:t>
+      </w:r>
+      <w:r>
+        <w:rPr>
+          <w:rFonts w:eastAsia="JetBrains Mono" w:cs="JetBrains Mono" w:ascii="JetBrains Mono" w:hAnsi="JetBrains Mono"/>
+          <w:color w:val="123A5F"/>
+          <w:sz w:val="18"/>
+          <w:szCs w:val="18"/>
+        </w:rPr>
+        <w:t>--admin-email admin@clinique-exemple.ma --admin-name "Admin Clinique" --admin-password 'Str0ng#Passw0rd2026' --lang fr</w:t>
+      </w:r>
+    </w:p>
+    <w:p>
+      <w:pPr>
+        <w:pStyle w:val="Normal"/>
+        <w:pBdr>
+          <w:left w:val="single" w:sz="12" w:space="8" w:color="1876C6"/>
+        </w:pBdr>
+        <w:shd w:val="clear" w:color="auto" w:fill="F5F8FB"/>
+        <w:spacing w:before="0" w:after="80"/>
+        <w:ind w:left="240"/>
+        <w:rPr/>
+      </w:pPr>
+      <w:r>
+        <w:rPr>
+          <w:rFonts w:eastAsia="JetBrains Mono" w:cs="JetBrains Mono" w:ascii="JetBrains Mono" w:hAnsi="JetBrains Mono"/>
+          <w:color w:val="123A5F"/>
+          <w:sz w:val="18"/>
+          <w:szCs w:val="18"/>
+        </w:rPr>
+        <w:t>./licence.sh request clinique-exemple.ma          # prints the Organization ID</w:t>
       </w:r>
     </w:p>
     <w:p>
@@ -5480,7 +5507,7 @@
           <w:sz w:val="22"/>
           <w:szCs w:val="22"/>
         </w:rPr>
-        <w:t xml:space="preserve">Install </w:t>
+        <w:t xml:space="preserve">Sign on your laptop </w:t>
       </w:r>
       <w:r>
         <w:rPr>
@@ -5489,7 +5516,30 @@
           <w:sz w:val="22"/>
           <w:szCs w:val="22"/>
         </w:rPr>
-        <w:t>(no restart):</w:t>
+        <w:t>(signing workspace) with the Organization ID printed, exactly as in section 5.2.</w:t>
+      </w:r>
+    </w:p>
+    <w:p>
+      <w:pPr>
+        <w:pStyle w:val="ListParagraph"/>
+        <w:numPr>
+          <w:ilvl w:val="0"/>
+          <w:numId w:val="0"/>
+        </w:numPr>
+        <w:spacing w:lineRule="auto" w:line="288" w:before="0" w:after="80"/>
+        <w:ind w:hanging="0" w:left="0"/>
+        <w:rPr/>
+      </w:pPr>
+      <w:r>
+        <w:rPr>
+          <w:rFonts w:eastAsia="Open Sans" w:cs="Open Sans"/>
+          <w:b/>
+          <w:bCs/>
+          <w:color w:val="2C3E50"/>
+          <w:sz w:val="22"/>
+          <w:szCs w:val="22"/>
+        </w:rPr>
+        <w:t>Copy the file to the VPS:</w:t>
       </w:r>
     </w:p>
     <w:p>
@@ -5510,7 +5560,81 @@
           <w:sz w:val="18"/>
           <w:szCs w:val="18"/>
         </w:rPr>
-        <w:t>docker compose exec cortexskills cortexskills-admin licence-install --file /licence/Clinique_Exemple.lic</w:t>
+        <w:t>scp ~/licences/Clinique_Exemple.lic user@skills.yourdomain.com:/opt/cortexskills/current/licence/</w:t>
+      </w:r>
+    </w:p>
+    <w:p>
+      <w:pPr>
+        <w:pStyle w:val="ListParagraph"/>
+        <w:numPr>
+          <w:ilvl w:val="0"/>
+          <w:numId w:val="0"/>
+        </w:numPr>
+        <w:spacing w:lineRule="auto" w:line="288" w:before="0" w:after="80"/>
+        <w:ind w:hanging="0" w:left="0"/>
+        <w:rPr/>
+      </w:pPr>
+      <w:r>
+        <w:rPr>
+          <w:rFonts w:eastAsia="Open Sans" w:cs="Open Sans"/>
+          <w:b/>
+          <w:bCs/>
+          <w:color w:val="2C3E50"/>
+          <w:sz w:val="22"/>
+          <w:szCs w:val="22"/>
+        </w:rPr>
+        <w:t xml:space="preserve">Install </w:t>
+      </w:r>
+      <w:r>
+        <w:rPr>
+          <w:rFonts w:eastAsia="Open Sans" w:cs="Open Sans"/>
+          <w:color w:val="2C3E50"/>
+          <w:sz w:val="22"/>
+          <w:szCs w:val="22"/>
+        </w:rPr>
+        <w:t>(no restart):</w:t>
+      </w:r>
+    </w:p>
+    <w:p>
+      <w:pPr>
+        <w:pStyle w:val="Normal"/>
+        <w:pBdr>
+          <w:left w:val="single" w:sz="12" w:space="8" w:color="1876C6"/>
+        </w:pBdr>
+        <w:shd w:val="clear" w:color="auto" w:fill="F5F8FB"/>
+        <w:spacing w:before="0" w:after="80"/>
+        <w:ind w:left="240"/>
+        <w:rPr/>
+      </w:pPr>
+      <w:r>
+        <w:rPr>
+          <w:rFonts w:eastAsia="JetBrains Mono" w:cs="JetBrains Mono" w:ascii="JetBrains Mono" w:hAnsi="JetBrains Mono"/>
+          <w:color w:val="123A5F"/>
+          <w:sz w:val="18"/>
+          <w:szCs w:val="18"/>
+        </w:rPr>
+        <w:t>./licence.sh install licence/Clinique_Exemple.lic</w:t>
+      </w:r>
+    </w:p>
+    <w:p>
+      <w:pPr>
+        <w:pStyle w:val="Normal"/>
+        <w:pBdr>
+          <w:left w:val="single" w:sz="12" w:space="8" w:color="1876C6"/>
+        </w:pBdr>
+        <w:shd w:val="clear" w:color="auto" w:fill="F5F8FB"/>
+        <w:spacing w:before="0" w:after="80"/>
+        <w:ind w:left="240"/>
+        <w:rPr/>
+      </w:pPr>
+      <w:r>
+        <w:rPr>
+          <w:rFonts w:eastAsia="JetBrains Mono" w:cs="JetBrains Mono" w:ascii="JetBrains Mono" w:hAnsi="JetBrains Mono"/>
+          <w:color w:val="123A5F"/>
+          <w:sz w:val="18"/>
+          <w:szCs w:val="18"/>
+        </w:rPr>
+        <w:t>./licence.sh list</w:t>
       </w:r>
     </w:p>
     <w:p>
@@ -5625,7 +5749,7 @@
         <w:spacing w:before="0" w:after="240"/>
         <w:rPr/>
       </w:pPr>
-      <w:bookmarkStart w:id="18" w:name="__RefHeading___Toc1287_2642403109"/>
+      <w:bookmarkStart w:id="18" w:name="__RefHeading___Toc606_3511503178"/>
       <w:bookmarkEnd w:id="18"/>
       <w:r>
         <w:rPr>
@@ -5768,7 +5892,7 @@
         <w:spacing w:before="320" w:after="120"/>
         <w:rPr/>
       </w:pPr>
-      <w:bookmarkStart w:id="19" w:name="__RefHeading___Toc1289_2642403109"/>
+      <w:bookmarkStart w:id="19" w:name="__RefHeading___Toc608_3511503178"/>
       <w:bookmarkEnd w:id="19"/>
       <w:r>
         <w:rPr>
@@ -6265,7 +6389,7 @@
       <w:r>
         <w:br w:type="page"/>
       </w:r>
-      <w:bookmarkStart w:id="20" w:name="__RefHeading___Toc1291_2642403109"/>
+      <w:bookmarkStart w:id="20" w:name="__RefHeading___Toc610_3511503178"/>
       <w:bookmarkEnd w:id="20"/>
       <w:r>
         <w:rPr>
@@ -6371,7 +6495,7 @@
         <w:spacing w:before="0" w:after="240"/>
         <w:rPr/>
       </w:pPr>
-      <w:bookmarkStart w:id="21" w:name="__RefHeading___Toc1293_2642403109"/>
+      <w:bookmarkStart w:id="21" w:name="__RefHeading___Toc612_3511503178"/>
       <w:bookmarkEnd w:id="21"/>
       <w:r>
         <w:rPr>
@@ -7009,7 +7133,7 @@
       <w:r>
         <w:br w:type="page"/>
       </w:r>
-      <w:bookmarkStart w:id="22" w:name="__RefHeading___Toc1295_2642403109"/>
+      <w:bookmarkStart w:id="22" w:name="__RefHeading___Toc614_3511503178"/>
       <w:bookmarkEnd w:id="22"/>
       <w:r>
         <w:rPr>
@@ -7452,7 +7576,7 @@
                 <w:sz w:val="16"/>
                 <w:szCs w:val="16"/>
               </w:rPr>
-              <w:t>Docker (VPS or customer)</w:t>
+              <w:t>Editor runtime (VPS)</w:t>
             </w:r>
           </w:p>
         </w:tc>
@@ -7482,7 +7606,7 @@
                 <w:sz w:val="16"/>
                 <w:szCs w:val="16"/>
               </w:rPr>
-              <w:t>docker compose exec cortexskills cortexskills-admin help | org-create | org-list | licence-request | licence-install | backup</w:t>
+              <w:t>./install.sh  ·  ./licence.sh create-org | list | request &lt;domain&gt; | install &lt;file.lic&gt;  ·  ./backup.sh  ·  ./update.sh &lt;current folder&gt;</w:t>
             </w:r>
           </w:p>
         </w:tc>
@@ -7512,7 +7636,7 @@
                 <w:sz w:val="16"/>
                 <w:szCs w:val="16"/>
               </w:rPr>
-              <w:t>Administer the container</w:t>
+              <w:t>Install and run your VPS</w:t>
             </w:r>
           </w:p>
         </w:tc>
@@ -7577,6 +7701,101 @@
                 <w:sz w:val="16"/>
                 <w:szCs w:val="16"/>
               </w:rPr>
+              <w:t>docker compose exec cortexskills cortexskills-admin help | org-create | org-list | licence-request | licence-install | backup</w:t>
+            </w:r>
+          </w:p>
+        </w:tc>
+        <w:tc>
+          <w:tcPr>
+            <w:tcW w:w="2446" w:type="dxa"/>
+            <w:tcBorders>
+              <w:top w:val="single" w:sz="4" w:space="0" w:color="E1E8F0"/>
+              <w:left w:val="single" w:sz="4" w:space="0" w:color="E1E8F0"/>
+              <w:bottom w:val="single" w:sz="4" w:space="0" w:color="E1E8F0"/>
+              <w:right w:val="single" w:sz="4" w:space="0" w:color="E1E8F0"/>
+            </w:tcBorders>
+            <w:shd w:color="auto" w:fill="FFFFFF" w:val="clear"/>
+          </w:tcPr>
+          <w:p>
+            <w:pPr>
+              <w:pStyle w:val="Normal"/>
+              <w:spacing w:before="0" w:after="20"/>
+              <w:rPr/>
+            </w:pPr>
+            <w:r>
+              <w:rPr>
+                <w:rFonts w:eastAsia="Open Sans" w:cs="Open Sans"/>
+                <w:b w:val="false"/>
+                <w:bCs w:val="false"/>
+                <w:color w:val="2C3E50"/>
+                <w:sz w:val="16"/>
+                <w:szCs w:val="16"/>
+              </w:rPr>
+              <w:t>Administer the container</w:t>
+            </w:r>
+          </w:p>
+        </w:tc>
+      </w:tr>
+      <w:tr>
+        <w:trPr>
+          <w:cantSplit w:val="true"/>
+        </w:trPr>
+        <w:tc>
+          <w:tcPr>
+            <w:tcW w:w="2198" w:type="dxa"/>
+            <w:tcBorders>
+              <w:top w:val="single" w:sz="4" w:space="0" w:color="E1E8F0"/>
+              <w:left w:val="single" w:sz="4" w:space="0" w:color="E1E8F0"/>
+              <w:bottom w:val="single" w:sz="4" w:space="0" w:color="E1E8F0"/>
+              <w:right w:val="single" w:sz="4" w:space="0" w:color="E1E8F0"/>
+            </w:tcBorders>
+            <w:shd w:color="auto" w:fill="F5F8FB" w:val="clear"/>
+          </w:tcPr>
+          <w:p>
+            <w:pPr>
+              <w:pStyle w:val="Normal"/>
+              <w:spacing w:before="0" w:after="20"/>
+              <w:rPr/>
+            </w:pPr>
+            <w:r>
+              <w:rPr>
+                <w:rFonts w:eastAsia="Open Sans" w:cs="Open Sans"/>
+                <w:b w:val="false"/>
+                <w:bCs w:val="false"/>
+                <w:color w:val="2C3E50"/>
+                <w:sz w:val="16"/>
+                <w:szCs w:val="16"/>
+              </w:rPr>
+              <w:t>Docker (VPS or customer)</w:t>
+            </w:r>
+          </w:p>
+        </w:tc>
+        <w:tc>
+          <w:tcPr>
+            <w:tcW w:w="4994" w:type="dxa"/>
+            <w:tcBorders>
+              <w:top w:val="single" w:sz="4" w:space="0" w:color="E1E8F0"/>
+              <w:left w:val="single" w:sz="4" w:space="0" w:color="E1E8F0"/>
+              <w:bottom w:val="single" w:sz="4" w:space="0" w:color="E1E8F0"/>
+              <w:right w:val="single" w:sz="4" w:space="0" w:color="E1E8F0"/>
+            </w:tcBorders>
+            <w:shd w:color="auto" w:fill="F5F8FB" w:val="clear"/>
+          </w:tcPr>
+          <w:p>
+            <w:pPr>
+              <w:pStyle w:val="Normal"/>
+              <w:spacing w:before="0" w:after="20"/>
+              <w:rPr/>
+            </w:pPr>
+            <w:r>
+              <w:rPr>
+                <w:rFonts w:eastAsia="Open Sans" w:cs="Open Sans"/>
+                <w:b w:val="false"/>
+                <w:bCs w:val="false"/>
+                <w:color w:val="2C3E50"/>
+                <w:sz w:val="16"/>
+                <w:szCs w:val="16"/>
+              </w:rPr>
               <w:t>docker compose run --rm --no-deps --entrypoint cortexskills-admin cortexskills restore &lt;file&gt;</w:t>
             </w:r>
           </w:p>
@@ -7590,7 +7809,7 @@
               <w:bottom w:val="single" w:sz="4" w:space="0" w:color="E1E8F0"/>
               <w:right w:val="single" w:sz="4" w:space="0" w:color="E1E8F0"/>
             </w:tcBorders>
-            <w:shd w:color="auto" w:fill="FFFFFF" w:val="clear"/>
+            <w:shd w:color="auto" w:fill="F5F8FB" w:val="clear"/>
           </w:tcPr>
           <w:p>
             <w:pPr>

</xml_diff>